<commit_message>
text change — Paxiss landing page
</commit_message>
<xml_diff>
--- a/IDE systems changes.docx
+++ b/IDE systems changes.docx
@@ -12,20 +12,46 @@
         <w:rPr>
           <w:lang w:val="en-US"/>
         </w:rPr>
-        <w:t>IDE systems changes</w:t>
-      </w:r>
-    </w:p>
-    <w:p>
-      <w:pPr>
-        <w:rPr>
-          <w:lang w:val="en-US"/>
-        </w:rPr>
-      </w:pPr>
-      <w:r>
-        <w:rPr>
-          <w:lang w:val="en-US"/>
-        </w:rPr>
-        <w:t xml:space="preserve">The logo is flush on the left with the edge of the screen, add some </w:t>
+        <w:t xml:space="preserve">IDE systems </w:t>
+      </w:r>
+      <w:r>
+        <w:rPr>
+          <w:lang w:val="en-US"/>
+        </w:rPr>
+        <w:t xml:space="preserve">PRAXISS </w:t>
+      </w:r>
+      <w:r>
+        <w:rPr>
+          <w:lang w:val="en-US"/>
+        </w:rPr>
+        <w:t>changes</w:t>
+      </w:r>
+    </w:p>
+    <w:p>
+      <w:pPr>
+        <w:rPr>
+          <w:lang w:val="en-US"/>
+        </w:rPr>
+      </w:pPr>
+      <w:r>
+        <w:rPr>
+          <w:lang w:val="en-US"/>
+        </w:rPr>
+        <w:t xml:space="preserve">The </w:t>
+      </w:r>
+      <w:proofErr w:type="gramStart"/>
+      <w:r>
+        <w:rPr>
+          <w:lang w:val="en-US"/>
+        </w:rPr>
+        <w:t>logo is flush</w:t>
+      </w:r>
+      <w:proofErr w:type="gramEnd"/>
+      <w:r>
+        <w:rPr>
+          <w:lang w:val="en-US"/>
+        </w:rPr>
+        <w:t xml:space="preserve"> on the left with the edge of the screen, add some </w:t>
       </w:r>
       <w:r>
         <w:rPr>
@@ -37,7 +63,23 @@
         <w:rPr>
           <w:lang w:val="en-US"/>
         </w:rPr>
-        <w:t>, so its inline with the logo in the footer.</w:t>
+        <w:t xml:space="preserve">, so its </w:t>
+      </w:r>
+      <w:proofErr w:type="spellStart"/>
+      <w:proofErr w:type="gramStart"/>
+      <w:r>
+        <w:rPr>
+          <w:lang w:val="en-US"/>
+        </w:rPr>
+        <w:t>inline</w:t>
+      </w:r>
+      <w:proofErr w:type="spellEnd"/>
+      <w:proofErr w:type="gramEnd"/>
+      <w:r>
+        <w:rPr>
+          <w:lang w:val="en-US"/>
+        </w:rPr>
+        <w:t xml:space="preserve"> with the logo in the footer.</w:t>
       </w:r>
     </w:p>
     <w:p>
@@ -92,7 +134,35 @@
         <w:rPr>
           <w:lang w:val="en-US"/>
         </w:rPr>
-        <w:t>The heading font could be hard to read on all sizes. I like the bold style, just give me a different font w</w:t>
+        <w:t xml:space="preserve">The heading font could be hard to read </w:t>
+      </w:r>
+      <w:proofErr w:type="gramStart"/>
+      <w:r>
+        <w:rPr>
+          <w:lang w:val="en-US"/>
+        </w:rPr>
+        <w:t>on</w:t>
+      </w:r>
+      <w:proofErr w:type="gramEnd"/>
+      <w:r>
+        <w:rPr>
+          <w:lang w:val="en-US"/>
+        </w:rPr>
+        <w:t xml:space="preserve"> all sizes. I like the bold style, </w:t>
+      </w:r>
+      <w:proofErr w:type="gramStart"/>
+      <w:r>
+        <w:rPr>
+          <w:lang w:val="en-US"/>
+        </w:rPr>
+        <w:t>just give me</w:t>
+      </w:r>
+      <w:proofErr w:type="gramEnd"/>
+      <w:r>
+        <w:rPr>
+          <w:lang w:val="en-US"/>
+        </w:rPr>
+        <w:t xml:space="preserve"> a different font w</w:t>
       </w:r>
       <w:r>
         <w:rPr>
@@ -118,13 +188,43 @@
         <w:rPr>
           <w:lang w:val="en-US"/>
         </w:rPr>
-        <w:t>Since client doesn’t have any good images beyond generic stock images, lets liven the layout up with colour gradient sections</w:t>
-      </w:r>
-      <w:r>
-        <w:rPr>
-          <w:lang w:val="en-US"/>
-        </w:rPr>
-        <w:t xml:space="preserve">, in the same style as the hero section, just different color schemes that compliment the current palette. </w:t>
+        <w:t xml:space="preserve">Since client doesn’t have any good images beyond generic stock images, </w:t>
+      </w:r>
+      <w:proofErr w:type="gramStart"/>
+      <w:r>
+        <w:rPr>
+          <w:lang w:val="en-US"/>
+        </w:rPr>
+        <w:t>lets</w:t>
+      </w:r>
+      <w:proofErr w:type="gramEnd"/>
+      <w:r>
+        <w:rPr>
+          <w:lang w:val="en-US"/>
+        </w:rPr>
+        <w:t xml:space="preserve"> liven the layout up with colour gradient sections</w:t>
+      </w:r>
+      <w:r>
+        <w:rPr>
+          <w:lang w:val="en-US"/>
+        </w:rPr>
+        <w:t xml:space="preserve">, in the same style as the hero section, just different color schemes that </w:t>
+      </w:r>
+      <w:proofErr w:type="spellStart"/>
+      <w:proofErr w:type="gramStart"/>
+      <w:r>
+        <w:rPr>
+          <w:lang w:val="en-US"/>
+        </w:rPr>
+        <w:t>compliment</w:t>
+      </w:r>
+      <w:proofErr w:type="spellEnd"/>
+      <w:proofErr w:type="gramEnd"/>
+      <w:r>
+        <w:rPr>
+          <w:lang w:val="en-US"/>
+        </w:rPr>
+        <w:t xml:space="preserve"> the current palette. </w:t>
       </w:r>
       <w:r>
         <w:rPr>
@@ -155,13 +255,41 @@
         <w:rPr>
           <w:lang w:val="en-US"/>
         </w:rPr>
-        <w:t xml:space="preserve">, using a dark themed background to reverse the colors, then also make the card backgrounds a very light transparent shade, so it’s </w:t>
-      </w:r>
-      <w:r>
-        <w:rPr>
-          <w:lang w:val="en-US"/>
-        </w:rPr>
-        <w:t>a super premium feel.</w:t>
+        <w:t xml:space="preserve">, using a dark themed background to reverse the colors, then also </w:t>
+      </w:r>
+      <w:proofErr w:type="gramStart"/>
+      <w:r>
+        <w:rPr>
+          <w:lang w:val="en-US"/>
+        </w:rPr>
+        <w:t>make</w:t>
+      </w:r>
+      <w:proofErr w:type="gramEnd"/>
+      <w:r>
+        <w:rPr>
+          <w:lang w:val="en-US"/>
+        </w:rPr>
+        <w:t xml:space="preserve"> the card backgrounds a very light transparent shade, so it’s </w:t>
+      </w:r>
+      <w:r>
+        <w:rPr>
+          <w:lang w:val="en-US"/>
+        </w:rPr>
+        <w:t xml:space="preserve">a </w:t>
+      </w:r>
+      <w:proofErr w:type="spellStart"/>
+      <w:r>
+        <w:rPr>
+          <w:lang w:val="en-US"/>
+        </w:rPr>
+        <w:t>super premium</w:t>
+      </w:r>
+      <w:proofErr w:type="spellEnd"/>
+      <w:r>
+        <w:rPr>
+          <w:lang w:val="en-US"/>
+        </w:rPr>
+        <w:t xml:space="preserve"> feel.</w:t>
       </w:r>
     </w:p>
     <w:p>
@@ -250,7 +378,21 @@
         <w:rPr>
           <w:lang w:val="en-US"/>
         </w:rPr>
-        <w:t xml:space="preserve">Also use the orange as accent color in the footer, where it makes the most sense, either in the text or </w:t>
+        <w:t xml:space="preserve">Also use </w:t>
+      </w:r>
+      <w:proofErr w:type="gramStart"/>
+      <w:r>
+        <w:rPr>
+          <w:lang w:val="en-US"/>
+        </w:rPr>
+        <w:t>the orange</w:t>
+      </w:r>
+      <w:proofErr w:type="gramEnd"/>
+      <w:r>
+        <w:rPr>
+          <w:lang w:val="en-US"/>
+        </w:rPr>
+        <w:t xml:space="preserve"> as accent color in the footer, where it makes the most sense, either in the text or </w:t>
       </w:r>
       <w:r>
         <w:rPr>
@@ -345,17 +487,39 @@
         </w:rPr>
         <w:t xml:space="preserve">I don’t like the new heading font, </w:t>
       </w:r>
-      <w:r>
-        <w:rPr>
-          <w:lang w:val="en-US"/>
-        </w:rPr>
-        <w:t xml:space="preserve">its too plain. </w:t>
-      </w:r>
-      <w:r>
-        <w:rPr>
-          <w:lang w:val="en-US"/>
-        </w:rPr>
-        <w:t xml:space="preserve">Use the zen dots font for headings from google fonts, alternatively a </w:t>
+      <w:proofErr w:type="spellStart"/>
+      <w:r>
+        <w:rPr>
+          <w:lang w:val="en-US"/>
+        </w:rPr>
+        <w:t>its</w:t>
+      </w:r>
+      <w:proofErr w:type="spellEnd"/>
+      <w:r>
+        <w:rPr>
+          <w:lang w:val="en-US"/>
+        </w:rPr>
+        <w:t xml:space="preserve"> too plain. </w:t>
+      </w:r>
+      <w:r>
+        <w:rPr>
+          <w:lang w:val="en-US"/>
+        </w:rPr>
+        <w:t xml:space="preserve">Use the </w:t>
+      </w:r>
+      <w:proofErr w:type="spellStart"/>
+      <w:r>
+        <w:rPr>
+          <w:lang w:val="en-US"/>
+        </w:rPr>
+        <w:t>zen</w:t>
+      </w:r>
+      <w:proofErr w:type="spellEnd"/>
+      <w:r>
+        <w:rPr>
+          <w:lang w:val="en-US"/>
+        </w:rPr>
+        <w:t xml:space="preserve"> dots font for headings from google fonts, alternatively a </w:t>
       </w:r>
       <w:r>
         <w:rPr>
@@ -539,20 +703,64 @@
         <w:rPr>
           <w:lang w:val="en-US"/>
         </w:rPr>
-        <w:t>Who its for section:</w:t>
-      </w:r>
-    </w:p>
-    <w:p>
-      <w:pPr>
-        <w:rPr>
-          <w:lang w:val="en-US"/>
-        </w:rPr>
-      </w:pPr>
-      <w:r>
-        <w:rPr>
-          <w:lang w:val="en-US"/>
-        </w:rPr>
-        <w:t>Header font color is still dark so its not visible. Also the cards’ font color is still white so its not visible.</w:t>
+        <w:t xml:space="preserve">Who </w:t>
+      </w:r>
+      <w:proofErr w:type="spellStart"/>
+      <w:proofErr w:type="gramStart"/>
+      <w:r>
+        <w:rPr>
+          <w:lang w:val="en-US"/>
+        </w:rPr>
+        <w:t>its</w:t>
+      </w:r>
+      <w:proofErr w:type="spellEnd"/>
+      <w:proofErr w:type="gramEnd"/>
+      <w:r>
+        <w:rPr>
+          <w:lang w:val="en-US"/>
+        </w:rPr>
+        <w:t xml:space="preserve"> for section:</w:t>
+      </w:r>
+    </w:p>
+    <w:p>
+      <w:pPr>
+        <w:rPr>
+          <w:lang w:val="en-US"/>
+        </w:rPr>
+      </w:pPr>
+      <w:r>
+        <w:rPr>
+          <w:lang w:val="en-US"/>
+        </w:rPr>
+        <w:t xml:space="preserve">Header font color is still dark so </w:t>
+      </w:r>
+      <w:proofErr w:type="spellStart"/>
+      <w:r>
+        <w:rPr>
+          <w:lang w:val="en-US"/>
+        </w:rPr>
+        <w:t>its</w:t>
+      </w:r>
+      <w:proofErr w:type="spellEnd"/>
+      <w:r>
+        <w:rPr>
+          <w:lang w:val="en-US"/>
+        </w:rPr>
+        <w:t xml:space="preserve"> not visible. Also the cards’ font color is still white so </w:t>
+      </w:r>
+      <w:proofErr w:type="spellStart"/>
+      <w:r>
+        <w:rPr>
+          <w:lang w:val="en-US"/>
+        </w:rPr>
+        <w:t>its</w:t>
+      </w:r>
+      <w:proofErr w:type="spellEnd"/>
+      <w:r>
+        <w:rPr>
+          <w:lang w:val="en-US"/>
+        </w:rPr>
+        <w:t xml:space="preserve"> not visible.</w:t>
       </w:r>
       <w:r>
         <w:rPr>
@@ -597,8 +805,16 @@
         <w:rPr>
           <w:lang w:val="en-US"/>
         </w:rPr>
-        <w:t>Still white, use the dark colouring</w:t>
-      </w:r>
+        <w:t xml:space="preserve">Still white, use the dark </w:t>
+      </w:r>
+      <w:proofErr w:type="spellStart"/>
+      <w:r>
+        <w:rPr>
+          <w:lang w:val="en-US"/>
+        </w:rPr>
+        <w:t>colouring</w:t>
+      </w:r>
+      <w:proofErr w:type="spellEnd"/>
     </w:p>
     <w:p>
       <w:pPr>
@@ -630,7 +846,21 @@
         <w:rPr>
           <w:lang w:val="en-US"/>
         </w:rPr>
-        <w:t>Make the cards the dark</w:t>
+        <w:t xml:space="preserve">Make the cards </w:t>
+      </w:r>
+      <w:proofErr w:type="gramStart"/>
+      <w:r>
+        <w:rPr>
+          <w:lang w:val="en-US"/>
+        </w:rPr>
+        <w:t>the</w:t>
+      </w:r>
+      <w:proofErr w:type="gramEnd"/>
+      <w:r>
+        <w:rPr>
+          <w:lang w:val="en-US"/>
+        </w:rPr>
+        <w:t xml:space="preserve"> dark</w:t>
       </w:r>
       <w:r>
         <w:rPr>
@@ -707,6 +937,11 @@
       </w:pPr>
     </w:p>
     <w:p>
+      <w:pPr>
+        <w:rPr>
+          <w:lang w:val="en-US"/>
+        </w:rPr>
+      </w:pPr>
       <w:r>
         <w:rPr>
           <w:lang w:val="en-US"/>
@@ -715,29 +950,22 @@
       </w:r>
       <w:r>
         <w:rPr>
-          <w:rFonts w:ascii="DM Sans" w:hAnsi="DM Sans"/>
-          <w:sz w:val="20"/>
-          <w:szCs w:val="20"/>
-          <w:shd w:val="clear" w:color="auto" w:fill="050912"/>
+          <w:lang w:val="en-US"/>
         </w:rPr>
         <w:t>Website design by </w:t>
       </w:r>
       <w:hyperlink r:id="rId5" w:tgtFrame="_blank" w:history="1">
         <w:r>
           <w:rPr>
-            <w:rStyle w:val="Hyperlink"/>
-            <w:rFonts w:ascii="DM Sans" w:hAnsi="DM Sans"/>
-            <w:color w:val="E05A1E"/>
-            <w:sz w:val="20"/>
-            <w:szCs w:val="20"/>
-            <w:u w:val="none"/>
-            <w:bdr w:val="single" w:sz="2" w:space="0" w:color="E5E7EB" w:frame="1"/>
-            <w:shd w:val="clear" w:color="auto" w:fill="050912"/>
+            <w:lang w:val="en-US"/>
           </w:rPr>
           <w:t>Flint and Fuel Creative</w:t>
         </w:r>
       </w:hyperlink>
       <w:r>
+        <w:rPr>
+          <w:lang w:val="en-US"/>
+        </w:rPr>
         <w:t xml:space="preserve"> to the bottom bar – as part of the copyright statement</w:t>
       </w:r>
     </w:p>
@@ -1070,7 +1298,15 @@
     <w:p/>
     <w:p>
       <w:r>
-        <w:t>Who its for</w:t>
+        <w:t xml:space="preserve">Who </w:t>
+      </w:r>
+      <w:proofErr w:type="spellStart"/>
+      <w:r>
+        <w:t>its</w:t>
+      </w:r>
+      <w:proofErr w:type="spellEnd"/>
+      <w:r>
+        <w:t xml:space="preserve"> for</w:t>
       </w:r>
     </w:p>
     <w:p/>
@@ -1335,7 +1571,15 @@
         <w:t xml:space="preserve">Also make this left aligned to </w:t>
       </w:r>
       <w:r>
-        <w:t>be inline with the rest of the site</w:t>
+        <w:t xml:space="preserve">be </w:t>
+      </w:r>
+      <w:proofErr w:type="spellStart"/>
+      <w:r>
+        <w:t>inline</w:t>
+      </w:r>
+      <w:proofErr w:type="spellEnd"/>
+      <w:r>
+        <w:t xml:space="preserve"> with the rest of the site</w:t>
       </w:r>
     </w:p>
     <w:p/>
@@ -1542,13 +1786,7 @@
     </w:p>
     <w:p>
       <w:r>
-        <w:t xml:space="preserve">change FEATURES in menu to SOLUTIONS. </w:t>
-      </w:r>
-      <w:r>
-        <w:t>A</w:t>
-      </w:r>
-      <w:r>
-        <w:t>lso</w:t>
+        <w:t>change FEATURES in menu to SOLUTIONS. Also</w:t>
       </w:r>
       <w:r>
         <w:t xml:space="preserve"> change the menu hamburger breakpoint</w:t>
@@ -1563,6 +1801,19 @@
         <w:t>reduce the section spacing above COMPLIANCE, since its 2 white sections, the gap is too much</w:t>
       </w:r>
     </w:p>
+    <w:p/>
+    <w:p>
+      <w:r>
+        <w:t>round 6</w:t>
+      </w:r>
+    </w:p>
+    <w:p>
+      <w:r>
+        <w:t>WHO’s it for section</w:t>
+      </w:r>
+    </w:p>
+    <w:p/>
+    <w:p/>
     <w:sectPr>
       <w:pgSz w:w="11906" w:h="16838"/>
       <w:pgMar w:top="1440" w:right="1440" w:bottom="1440" w:left="1440" w:header="708" w:footer="708" w:gutter="0"/>

</xml_diff>